<commit_message>
feat(rpc): elevate RPC module to luxury typography aesthetic, remove raw icons, and refresh all subject readers
</commit_message>
<xml_diff>
--- a/First Sem 1st Year/Subjects/RPC/New_RPC_Public_Publish_and_Codal_Compendium.docx
+++ b/First Sem 1st Year/Subjects/RPC/New_RPC_Public_Publish_and_Codal_Compendium.docx
@@ -229,7 +229,7 @@
                 <w:color w:val="1B365D"/>
                 <w:sz w:val="21"/>
               </w:rPr>
-              <w:t>📌 EXECUTIVE DOCTRINE: ENACTED LAW VS. PROPOSED CODE</w:t>
+              <w:t>EXECUTIVE DOCTRINE: ENACTED LAW VS. PROPOSED CODE</w:t>
               <w:br/>
             </w:r>
           </w:p>
@@ -1141,7 +1141,7 @@
           <w:color w:val="1E3A8A"/>
           <w:sz w:val="22"/>
         </w:rPr>
-        <w:t>⚖️ Preliminary Title &amp; Article 2: Territoriality &amp; Extraterritoriality</w:t>
+        <w:t>Preliminary Title &amp; Article 2: Territoriality &amp; Extraterritoriality</w:t>
         <w:br/>
       </w:r>
       <w:r>
@@ -1164,7 +1164,7 @@
           <w:color w:val="1E3A8A"/>
           <w:sz w:val="22"/>
         </w:rPr>
-        <w:t>⚖️ Article 3: Felonies Committed by Deceit (Dolo) and Fault (Culpa)</w:t>
+        <w:t>Article 3: Felonies Committed by Deceit (Dolo) and Fault (Culpa)</w:t>
         <w:br/>
       </w:r>
       <w:r>
@@ -1187,7 +1187,7 @@
           <w:color w:val="1E3A8A"/>
           <w:sz w:val="22"/>
         </w:rPr>
-        <w:t>⚖️ Articles 4–6: Extent of Criminal Liability &amp; Stages of Execution</w:t>
+        <w:t>Articles 4–6: Extent of Criminal Liability &amp; Stages of Execution</w:t>
         <w:br/>
       </w:r>
       <w:r>
@@ -1212,7 +1212,7 @@
           <w:color w:val="1E3A8A"/>
           <w:sz w:val="22"/>
         </w:rPr>
-        <w:t>⚖️ Articles 11–12: Justifying and Exempting Circumstances</w:t>
+        <w:t>Articles 11–12: Justifying and Exempting Circumstances</w:t>
         <w:br/>
       </w:r>
       <w:r>
@@ -1237,7 +1237,7 @@
           <w:color w:val="1E3A8A"/>
           <w:sz w:val="22"/>
         </w:rPr>
-        <w:t>⚖️ Articles 13–15: Mitigating, Aggravating, and Alternative Circumstances</w:t>
+        <w:t>Articles 13–15: Mitigating, Aggravating, and Alternative Circumstances</w:t>
         <w:br/>
       </w:r>
       <w:r>
@@ -1264,7 +1264,7 @@
           <w:color w:val="1E3A8A"/>
           <w:sz w:val="22"/>
         </w:rPr>
-        <w:t>⚖️ Articles 21–88: Modernized Penalty Framework &amp; Preventive Imprisonment</w:t>
+        <w:t>Articles 21–88: Modernized Penalty Framework &amp; Preventive Imprisonment</w:t>
         <w:br/>
       </w:r>
       <w:r>
@@ -1297,7 +1297,7 @@
           <w:color w:val="0F294A"/>
           <w:sz w:val="22"/>
         </w:rPr>
-        <w:t>📖 Title 1: Crimes Against National Security &amp; Law of Nations (Arts. 114–123)</w:t>
+        <w:t>Title 1: Crimes Against National Security &amp; Law of Nations (Arts. 114–123)</w:t>
         <w:br/>
       </w:r>
       <w:r>
@@ -1320,7 +1320,7 @@
           <w:color w:val="0F294A"/>
           <w:sz w:val="22"/>
         </w:rPr>
-        <w:t>📖 Title 2: Crimes Against the Fundamental Laws of the State (Arts. 124–133)</w:t>
+        <w:t>Title 2: Crimes Against the Fundamental Laws of the State (Arts. 124–133)</w:t>
         <w:br/>
       </w:r>
       <w:r>
@@ -1343,7 +1343,7 @@
           <w:color w:val="0F294A"/>
           <w:sz w:val="22"/>
         </w:rPr>
-        <w:t>📖 Title 3: Crimes Against Public Order (Arts. 134–160)</w:t>
+        <w:t>Title 3: Crimes Against Public Order (Arts. 134–160)</w:t>
         <w:br/>
       </w:r>
       <w:r>
@@ -1366,7 +1366,7 @@
           <w:color w:val="0F294A"/>
           <w:sz w:val="22"/>
         </w:rPr>
-        <w:t>📖 Title 4: Crimes Against Public Interest (Arts. 161–189)</w:t>
+        <w:t>Title 4: Crimes Against Public Interest (Arts. 161–189)</w:t>
         <w:br/>
       </w:r>
       <w:r>
@@ -1389,7 +1389,7 @@
           <w:color w:val="0F294A"/>
           <w:sz w:val="22"/>
         </w:rPr>
-        <w:t>📖 Title 7: Crimes Committed by Public Officers (Arts. 203–245)</w:t>
+        <w:t>Title 7: Crimes Committed by Public Officers (Arts. 203–245)</w:t>
         <w:br/>
       </w:r>
       <w:r>
@@ -1412,7 +1412,7 @@
           <w:color w:val="0F294A"/>
           <w:sz w:val="22"/>
         </w:rPr>
-        <w:t>📖 Title 8: Crimes Against Persons (Arts. 246–266-D)</w:t>
+        <w:t>Title 8: Crimes Against Persons (Arts. 246–266-D)</w:t>
         <w:br/>
       </w:r>
       <w:r>
@@ -1435,7 +1435,7 @@
           <w:color w:val="0F294A"/>
           <w:sz w:val="22"/>
         </w:rPr>
-        <w:t>📖 Title 9: Crimes Against Personal Liberty and Security (Arts. 267–292)</w:t>
+        <w:t>Title 9: Crimes Against Personal Liberty and Security (Arts. 267–292)</w:t>
         <w:br/>
       </w:r>
       <w:r>
@@ -1458,7 +1458,7 @@
           <w:color w:val="0F294A"/>
           <w:sz w:val="22"/>
         </w:rPr>
-        <w:t>📖 Title 10: Crimes Against Property (Arts. 293–332)</w:t>
+        <w:t>Title 10: Crimes Against Property (Arts. 293–332)</w:t>
         <w:br/>
       </w:r>
       <w:r>
@@ -1481,7 +1481,7 @@
           <w:color w:val="0F294A"/>
           <w:sz w:val="22"/>
         </w:rPr>
-        <w:t>📖 Title 11: Crimes Against Chastity (Arts. 333–346)</w:t>
+        <w:t>Title 11: Crimes Against Chastity (Arts. 333–346)</w:t>
         <w:br/>
       </w:r>
       <w:r>
@@ -1504,7 +1504,7 @@
           <w:color w:val="0F294A"/>
           <w:sz w:val="22"/>
         </w:rPr>
-        <w:t>📖 Title 13 &amp; 14: Crimes Against Honor &amp; Quasi-Offenses (Arts. 353–365)</w:t>
+        <w:t>Title 13 &amp; 14: Crimes Against Honor &amp; Quasi-Offenses (Arts. 353–365)</w:t>
         <w:br/>
       </w:r>
       <w:r>
@@ -2661,7 +2661,7 @@
           <w:color w:val="1B365D"/>
           <w:sz w:val="20"/>
         </w:rPr>
-        <w:t xml:space="preserve">📌 Republic Act No. 11648 (2022) - Raising Age of Sexual Consent: </w:t>
+        <w:t xml:space="preserve">Republic Act No. 11648 (2022) - Raising Age of Sexual Consent: </w:t>
       </w:r>
       <w:r>
         <w:rPr>
@@ -2683,7 +2683,7 @@
           <w:color w:val="1B365D"/>
           <w:sz w:val="20"/>
         </w:rPr>
-        <w:t xml:space="preserve">📌 Republic Act No. 11594 (2021) - Strengthening Anti-Perjury Law: </w:t>
+        <w:t xml:space="preserve">Republic Act No. 11594 (2021) - Strengthening Anti-Perjury Law: </w:t>
       </w:r>
       <w:r>
         <w:rPr>
@@ -2705,7 +2705,7 @@
           <w:color w:val="1B365D"/>
           <w:sz w:val="20"/>
         </w:rPr>
-        <w:t xml:space="preserve">📌 Republic Act No. 10592 (2013) - Good Conduct Time Allowance (GCTA): </w:t>
+        <w:t xml:space="preserve">Republic Act No. 10592 (2013) - Good Conduct Time Allowance (GCTA): </w:t>
       </w:r>
       <w:r>
         <w:rPr>
@@ -2727,7 +2727,7 @@
           <w:color w:val="1B365D"/>
           <w:sz w:val="20"/>
         </w:rPr>
-        <w:t xml:space="preserve">📌 Republic Act No. 10175 (2012) - Cybercrime Prevention Act: </w:t>
+        <w:t xml:space="preserve">Republic Act No. 10175 (2012) - Cybercrime Prevention Act: </w:t>
       </w:r>
       <w:r>
         <w:rPr>

</xml_diff>